<commit_message>
Lab 4 + Lab 5 dry-run fixes (timing, Priority callout, 10 fields, restrict picklists, Timing section)
</commit_message>
<xml_diff>
--- a/workshop-site/labs/Lab 04 - Participant.docx
+++ b/workshop-site/labs/Lab 04 - Participant.docx
@@ -25,7 +25,7 @@
           <w:color w:val="6A6A6A"/>
           <w:sz w:val="20"/>
         </w:rPr>
-        <w:t>ServicePulse 360 Workshop v0.7 (revision 3) | Estimated time: 60 minutes | Create a Work Type, trim the Work Order Layout to the fields that matter for MTA, escalate your golden Case record into a Work Order, and verify the Case-Asset-Work Order relationship chain.</w:t>
+        <w:t>ServicePulse 360 Workshop v0.7 (revision 4) | Estimated time: 60 minutes | Create a Work Type, trim the Work Order Layout to the fields that matter for MTA, escalate your golden Case record into a Work Order, and verify the Case-Asset-Work Order relationship chain.</w:t>
       </w:r>
     </w:p>
     <w:p>
@@ -431,10 +431,7 @@
         <w:ind w:left="680" w:hanging="227"/>
       </w:pPr>
       <w:r>
-        <w:t xml:space="preserve">• </w:t>
-      </w:r>
-      <w:r>
-        <w:t>Work Type Name</w:t>
+        <w:t xml:space="preserve">• Work Type Name</w:t>
       </w:r>
     </w:p>
     <w:p>
@@ -443,10 +440,7 @@
         <w:ind w:left="680" w:hanging="227"/>
       </w:pPr>
       <w:r>
-        <w:t xml:space="preserve">• </w:t>
-      </w:r>
-      <w:r>
-        <w:t>Description</w:t>
+        <w:t xml:space="preserve">• Description</w:t>
       </w:r>
     </w:p>
     <w:p>
@@ -455,10 +449,7 @@
         <w:ind w:left="680" w:hanging="227"/>
       </w:pPr>
       <w:r>
-        <w:t xml:space="preserve">• </w:t>
-      </w:r>
-      <w:r>
-        <w:t>Estimated Duration</w:t>
+        <w:t xml:space="preserve">• Estimated Duration</w:t>
       </w:r>
     </w:p>
     <w:p>
@@ -467,10 +458,7 @@
         <w:ind w:left="680" w:hanging="227"/>
       </w:pPr>
       <w:r>
-        <w:t xml:space="preserve">• </w:t>
-      </w:r>
-      <w:r>
-        <w:t>Duration Type</w:t>
+        <w:t xml:space="preserve">• Duration Type</w:t>
       </w:r>
     </w:p>
     <w:p>
@@ -479,10 +467,7 @@
         <w:ind w:left="680" w:hanging="227"/>
       </w:pPr>
       <w:r>
-        <w:t xml:space="preserve">• </w:t>
-      </w:r>
-      <w:r>
-        <w:t>Owner</w:t>
+        <w:t xml:space="preserve">• Owner</w:t>
       </w:r>
     </w:p>
     <w:p>
@@ -771,10 +756,7 @@
         <w:ind w:left="680" w:hanging="227"/>
       </w:pPr>
       <w:r>
-        <w:t xml:space="preserve">• </w:t>
-      </w:r>
-      <w:r>
-        <w:t>Parent Work Order (we'll re-add this to System Information in a later step)</w:t>
+        <w:t xml:space="preserve">• Parent Work Order (we'll re-add this to System Information in a later step)</w:t>
       </w:r>
     </w:p>
     <w:p>
@@ -783,10 +765,7 @@
         <w:ind w:left="680" w:hanging="227"/>
       </w:pPr>
       <w:r>
-        <w:t xml:space="preserve">• </w:t>
-      </w:r>
-      <w:r>
-        <w:t>Service Contract</w:t>
+        <w:t xml:space="preserve">• Service Contract</w:t>
       </w:r>
     </w:p>
     <w:p>
@@ -795,10 +774,7 @@
         <w:ind w:left="680" w:hanging="227"/>
       </w:pPr>
       <w:r>
-        <w:t xml:space="preserve">• </w:t>
-      </w:r>
-      <w:r>
-        <w:t>Contact</w:t>
+        <w:t xml:space="preserve">• Contact</w:t>
       </w:r>
     </w:p>
     <w:p>
@@ -807,10 +783,7 @@
         <w:ind w:left="680" w:hanging="227"/>
       </w:pPr>
       <w:r>
-        <w:t xml:space="preserve">• </w:t>
-      </w:r>
-      <w:r>
-        <w:t>Entitlement</w:t>
+        <w:t xml:space="preserve">• Entitlement</w:t>
       </w:r>
     </w:p>
     <w:p>
@@ -851,10 +824,7 @@
         <w:ind w:left="680" w:hanging="227"/>
       </w:pPr>
       <w:r>
-        <w:t xml:space="preserve">• </w:t>
-      </w:r>
-      <w:r>
-        <w:t>Work Order Number</w:t>
+        <w:t xml:space="preserve">• Work Order Number</w:t>
       </w:r>
     </w:p>
     <w:p>
@@ -863,10 +833,7 @@
         <w:ind w:left="680" w:hanging="227"/>
       </w:pPr>
       <w:r>
-        <w:t xml:space="preserve">• </w:t>
-      </w:r>
-      <w:r>
-        <w:t>Priority</w:t>
+        <w:t xml:space="preserve">• Priority</w:t>
       </w:r>
     </w:p>
     <w:p>
@@ -875,10 +842,7 @@
         <w:ind w:left="680" w:hanging="227"/>
       </w:pPr>
       <w:r>
-        <w:t xml:space="preserve">• </w:t>
-      </w:r>
-      <w:r>
-        <w:t>Status</w:t>
+        <w:t xml:space="preserve">• Status</w:t>
       </w:r>
     </w:p>
     <w:p>
@@ -887,10 +851,7 @@
         <w:ind w:left="680" w:hanging="227"/>
       </w:pPr>
       <w:r>
-        <w:t xml:space="preserve">• </w:t>
-      </w:r>
-      <w:r>
-        <w:t>Owner</w:t>
+        <w:t xml:space="preserve">• Owner</w:t>
       </w:r>
     </w:p>
     <w:p>
@@ -899,10 +860,7 @@
         <w:ind w:left="680" w:hanging="227"/>
       </w:pPr>
       <w:r>
-        <w:t xml:space="preserve">• </w:t>
-      </w:r>
-      <w:r>
-        <w:t>Account</w:t>
+        <w:t xml:space="preserve">• Account</w:t>
       </w:r>
     </w:p>
     <w:p>
@@ -911,10 +869,7 @@
         <w:ind w:left="680" w:hanging="227"/>
       </w:pPr>
       <w:r>
-        <w:t xml:space="preserve">• </w:t>
-      </w:r>
-      <w:r>
-        <w:t>Case</w:t>
+        <w:t xml:space="preserve">• Case</w:t>
       </w:r>
     </w:p>
     <w:p>
@@ -953,10 +908,7 @@
         <w:ind w:left="680" w:hanging="227"/>
       </w:pPr>
       <w:r>
-        <w:t xml:space="preserve">• </w:t>
-      </w:r>
-      <w:r>
-        <w:t>Start Date</w:t>
+        <w:t xml:space="preserve">• Start Date</w:t>
       </w:r>
     </w:p>
     <w:p>
@@ -965,10 +917,7 @@
         <w:ind w:left="680" w:hanging="227"/>
       </w:pPr>
       <w:r>
-        <w:t xml:space="preserve">• </w:t>
-      </w:r>
-      <w:r>
-        <w:t>End Date</w:t>
+        <w:t xml:space="preserve">• End Date</w:t>
       </w:r>
     </w:p>
     <w:p>
@@ -977,10 +926,7 @@
         <w:ind w:left="680" w:hanging="227"/>
       </w:pPr>
       <w:r>
-        <w:t xml:space="preserve">• </w:t>
-      </w:r>
-      <w:r>
-        <w:t>Work Type</w:t>
+        <w:t xml:space="preserve">• Work Type</w:t>
       </w:r>
     </w:p>
     <w:p>
@@ -989,10 +935,7 @@
         <w:ind w:left="680" w:hanging="227"/>
       </w:pPr>
       <w:r>
-        <w:t xml:space="preserve">• </w:t>
-      </w:r>
-      <w:r>
-        <w:t>Asset</w:t>
+        <w:t xml:space="preserve">• Asset</w:t>
       </w:r>
     </w:p>
     <w:p>
@@ -1016,10 +959,7 @@
         <w:ind w:left="680" w:hanging="227"/>
       </w:pPr>
       <w:r>
-        <w:t xml:space="preserve">• </w:t>
-      </w:r>
-      <w:r>
-        <w:t>Subject</w:t>
+        <w:t xml:space="preserve">• Subject</w:t>
       </w:r>
     </w:p>
     <w:p>
@@ -1028,10 +968,7 @@
         <w:ind w:left="680" w:hanging="227"/>
       </w:pPr>
       <w:r>
-        <w:t xml:space="preserve">• </w:t>
-      </w:r>
-      <w:r>
-        <w:t>Description</w:t>
+        <w:t xml:space="preserve">• Description</w:t>
       </w:r>
     </w:p>
     <w:p>
@@ -1055,10 +992,7 @@
         <w:ind w:left="680" w:hanging="227"/>
       </w:pPr>
       <w:r>
-        <w:t xml:space="preserve">• </w:t>
-      </w:r>
-      <w:r>
-        <w:t>Created By</w:t>
+        <w:t xml:space="preserve">• Created By</w:t>
       </w:r>
     </w:p>
     <w:p>
@@ -1067,10 +1001,7 @@
         <w:ind w:left="680" w:hanging="227"/>
       </w:pPr>
       <w:r>
-        <w:t xml:space="preserve">• </w:t>
-      </w:r>
-      <w:r>
-        <w:t>Last Modified By</w:t>
+        <w:t xml:space="preserve">• Last Modified By</w:t>
       </w:r>
     </w:p>
     <w:p>
@@ -1079,10 +1010,7 @@
         <w:ind w:left="680" w:hanging="227"/>
       </w:pPr>
       <w:r>
-        <w:t xml:space="preserve">• </w:t>
-      </w:r>
-      <w:r>
-        <w:t>Parent Work Order</w:t>
+        <w:t xml:space="preserve">• Parent Work Order</w:t>
       </w:r>
     </w:p>
     <w:p>
@@ -1324,10 +1252,7 @@
         <w:ind w:left="680" w:hanging="227"/>
       </w:pPr>
       <w:r>
-        <w:t xml:space="preserve">• </w:t>
-      </w:r>
-      <w:r>
-        <w:t>Subject: Dispatch: Signal fault repair on NYCT Bus 4521</w:t>
+        <w:t xml:space="preserve">• Subject: Dispatch: Signal fault repair on NYCT Bus 4521</w:t>
       </w:r>
     </w:p>
     <w:p>
@@ -1336,10 +1261,7 @@
         <w:ind w:left="680" w:hanging="227"/>
       </w:pPr>
       <w:r>
-        <w:t xml:space="preserve">• </w:t>
-      </w:r>
-      <w:r>
-        <w:t>Status: New</w:t>
+        <w:t xml:space="preserve">• Status: New</w:t>
       </w:r>
     </w:p>
     <w:p>
@@ -1348,22 +1270,23 @@
         <w:ind w:left="680" w:hanging="227"/>
       </w:pPr>
       <w:r>
-        <w:t xml:space="preserve">• </w:t>
-      </w:r>
-      <w:r>
-        <w:t>Priority: Medium</w:t>
+        <w:t xml:space="preserve">• Priority: Medium</w:t>
       </w:r>
     </w:p>
     <w:p>
       <w:pPr>
-        <w:spacing w:after="40"/>
-        <w:ind w:left="680" w:hanging="227"/>
+        <w:spacing w:before="80" w:after="80"/>
+        <w:ind w:left="227"/>
       </w:pPr>
       <w:r>
-        <w:t xml:space="preserve">• </w:t>
+        <w:rPr>
+          <w:b/>
+          <w:color w:val="B45F06"/>
+        </w:rPr>
+        <w:t xml:space="preserve">Watch out: </w:t>
       </w:r>
       <w:r>
-        <w:t>Work Type: pick the picker, search Signal Repair, select it</w:t>
+        <w:t>Work Order Priority uses the standard values Low/Medium/High/Critical, not the P1-P4 scale you built on Case Priority in Lab 1. Priority on Work Order is intentionally decoupled from Case Priority — the same incident can be a P2 Case (customer-facing severity) but a Medium Work Order (crew-facing scheduling urgency).</w:t>
       </w:r>
     </w:p>
     <w:p>
@@ -1372,10 +1295,7 @@
         <w:ind w:left="680" w:hanging="227"/>
       </w:pPr>
       <w:r>
-        <w:t xml:space="preserve">• </w:t>
-      </w:r>
-      <w:r>
-        <w:t>Case: should auto-populate with your golden Case record. Confirm this.</w:t>
+        <w:t xml:space="preserve">• Work Type: pick the picker, search Signal Repair, select it</w:t>
       </w:r>
     </w:p>
     <w:p>
@@ -1384,10 +1304,7 @@
         <w:ind w:left="680" w:hanging="227"/>
       </w:pPr>
       <w:r>
-        <w:t xml:space="preserve">• </w:t>
-      </w:r>
-      <w:r>
-        <w:t>Asset: pick NYCT Bus 4521 (if not auto-populated).</w:t>
+        <w:t xml:space="preserve">• Case: should auto-populate with your golden Case record. Confirm this.</w:t>
       </w:r>
     </w:p>
     <w:p>
@@ -1396,10 +1313,7 @@
         <w:ind w:left="680" w:hanging="227"/>
       </w:pPr>
       <w:r>
-        <w:t xml:space="preserve">• </w:t>
-      </w:r>
-      <w:r>
-        <w:t>Account: should auto-populate with MTA New York City Transit (inherited from the Case). If not, pick manually.</w:t>
+        <w:t xml:space="preserve">• Asset: pick NYCT Bus 4521 (if not auto-populated).</w:t>
       </w:r>
     </w:p>
     <w:p>
@@ -1408,10 +1322,7 @@
         <w:ind w:left="680" w:hanging="227"/>
       </w:pPr>
       <w:r>
-        <w:t xml:space="preserve">• </w:t>
-      </w:r>
-      <w:r>
-        <w:t>Description: Field tech dispatched to investigate signal fault reported on Bus 4521. Reference Case for context.</w:t>
+        <w:t xml:space="preserve">• Account: should auto-populate with MTA New York City Transit (inherited from the Case). If not, pick manually.</w:t>
       </w:r>
     </w:p>
     <w:p>
@@ -1420,10 +1331,7 @@
         <w:ind w:left="680" w:hanging="227"/>
       </w:pPr>
       <w:r>
-        <w:t xml:space="preserve">• </w:t>
-      </w:r>
-      <w:r>
-        <w:t>Start Date: pick a date later today or tomorrow.</w:t>
+        <w:t xml:space="preserve">• Description: Field tech dispatched to investigate signal fault reported on Bus 4521. Reference Case for context.</w:t>
       </w:r>
     </w:p>
     <w:p>
@@ -1432,10 +1340,16 @@
         <w:ind w:left="680" w:hanging="227"/>
       </w:pPr>
       <w:r>
-        <w:t xml:space="preserve">• </w:t>
+        <w:t xml:space="preserve">• Start Date: pick a date later today or tomorrow.</w:t>
       </w:r>
+    </w:p>
+    <w:p>
+      <w:pPr>
+        <w:spacing w:after="40"/>
+        <w:ind w:left="680" w:hanging="227"/>
+      </w:pPr>
       <w:r>
-        <w:t>End Date: pick a date 1-2 days after Start Date.</w:t>
+        <w:t xml:space="preserve">• End Date: pick a date 1-2 days after Start Date.</w:t>
       </w:r>
     </w:p>
     <w:p>

</xml_diff>